<commit_message>
doc jornada: explica melhor o calculo do HOLOSCAN (depende das respostas; mesmas respostas, mesmo resultado)
Co-Authored-By: Claude Opus 5.5 <noreply@anthropic.com>
Claude-Session: https://claude.ai/code/session_018iLxAkFrJPcRJvTsgWQ3UZ
</commit_message>
<xml_diff>
--- a/docs/jornada/JORNADA-DA-NUTRICIONISTA-HOLOHACKING.docx
+++ b/docs/jornada/JORNADA-DA-NUTRICIONISTA-HOLOHACKING.docx
@@ -1081,7 +1081,7 @@
       </w:pPr>
       <w:r>
         <w:rPr/>
-        <w:t>Não é inteligência artificial que decide tratamento. O HOLOSCAN é um cálculo determinístico: as mesmas respostas dão sempre o mesmo resultado.</w:t>
+        <w:t>Não é inteligência artificial que decide tratamento. O HOLOSCAN segue uma regra fixa do método: o resultado depende só das respostas da paciente. Se ela responde diferente, o resultado muda; se as respostas forem exatamente as mesmas, a conta chega sempre ao mesmo resultado, sem sorteio e sem "opinião" do sistema.</w:t>
       </w:r>
     </w:p>
     <w:p>
@@ -4192,7 +4192,7 @@
           <w:color w:val="4F6A5D"/>
           <w:sz w:val="26"/>
         </w:rPr>
-        <w:t>O HOLOSCAN é o questionário estruturado do método. Ele organiza o que a paciente relata em cinco sistemas e ajuda a decidir por onde começar a conversa. Ele não é diagnóstico, não é exame e não é inteligência artificial: é um cálculo determinístico, sempre igual para as mesmas respostas.</w:t>
+        <w:t>O HOLOSCAN é o questionário estruturado do método. Ele organiza o que a paciente relata em cinco sistemas e ajuda a decidir por onde começar a conversa. Ele não é diagnóstico, não é exame e não é inteligência artificial: é uma regra fixa do método. O resultado depende só das respostas; respostas iguais levam sempre ao mesmo cálculo, e respostas diferentes mostram um momento diferente.</w:t>
       </w:r>
     </w:p>
     <w:p>
@@ -9724,7 +9724,7 @@
           <w:p>
             <w:r>
               <w:rPr/>
-              <w:t>Notas, Índice, Tríade, áreas para aprofundar, sinais e ferramentas sugeridas. É calculado e sempre igual para as mesmas respostas.</w:t>
+              <w:t>Notas, Índice, Tríade, áreas para aprofundar, sinais e ferramentas sugeridas. É calculado pela regra do método a partir das respostas da paciente: muda quando as respostas mudam.</w:t>
             </w:r>
           </w:p>
         </w:tc>

</xml_diff>